<commit_message>
finishing comparion clustering models
</commit_message>
<xml_diff>
--- a/_Clusterization/Conclusiones/Comparaciones UMAP vs NO.docx
+++ b/_Clusterization/Conclusiones/Comparaciones UMAP vs NO.docx
@@ -80,6 +80,9 @@
         <w:jc w:val="both"/>
       </w:pPr>
       <w:r>
+        <w:rPr>
+          <w:noProof/>
+        </w:rPr>
         <w:drawing>
           <wp:inline distT="0" distB="0" distL="0" distR="0" wp14:anchorId="00CD3C47" wp14:editId="39CDF43C">
             <wp:extent cx="5400040" cy="2752725"/>
@@ -96,7 +99,7 @@
                     <pic:cNvPicPr/>
                   </pic:nvPicPr>
                   <pic:blipFill>
-                    <a:blip r:embed="rId4"/>
+                    <a:blip r:embed="rId5"/>
                     <a:stretch>
                       <a:fillRect/>
                     </a:stretch>
@@ -441,6 +444,9 @@
         <w:jc w:val="center"/>
       </w:pPr>
       <w:r>
+        <w:rPr>
+          <w:noProof/>
+        </w:rPr>
         <w:drawing>
           <wp:inline distT="0" distB="0" distL="0" distR="0" wp14:anchorId="5E456F8E" wp14:editId="497D5EB7">
             <wp:extent cx="2419350" cy="3474876"/>
@@ -457,7 +463,7 @@
                     <pic:cNvPicPr/>
                   </pic:nvPicPr>
                   <pic:blipFill>
-                    <a:blip r:embed="rId5"/>
+                    <a:blip r:embed="rId6"/>
                     <a:stretch>
                       <a:fillRect/>
                     </a:stretch>
@@ -602,26 +608,723 @@
       </w:r>
     </w:p>
     <w:p>
+      <w:r>
+        <w:t xml:space="preserve">Los resultados de la comparación de los investigadores por </w:t>
+      </w:r>
+      <w:proofErr w:type="spellStart"/>
+      <w:proofErr w:type="gramStart"/>
+      <w:r>
+        <w:t>cluster</w:t>
+      </w:r>
+      <w:proofErr w:type="spellEnd"/>
+      <w:proofErr w:type="gramEnd"/>
+      <w:r>
+        <w:t xml:space="preserve"> son:</w:t>
+      </w:r>
+    </w:p>
+    <w:tbl>
+      <w:tblPr>
+        <w:tblStyle w:val="Tablaconcuadrcula"/>
+        <w:tblW w:w="0" w:type="auto"/>
+        <w:tblLook w:val="04A0" w:firstRow="1" w:lastRow="0" w:firstColumn="1" w:lastColumn="0" w:noHBand="0" w:noVBand="1"/>
+      </w:tblPr>
+      <w:tblGrid>
+        <w:gridCol w:w="1698"/>
+        <w:gridCol w:w="1699"/>
+        <w:gridCol w:w="1699"/>
+        <w:gridCol w:w="1699"/>
+        <w:gridCol w:w="1699"/>
+      </w:tblGrid>
+      <w:tr>
+        <w:tc>
+          <w:tcPr>
+            <w:tcW w:w="1698" w:type="dxa"/>
+          </w:tcPr>
+          <w:p>
+            <w:pPr>
+              <w:jc w:val="center"/>
+            </w:pPr>
+          </w:p>
+        </w:tc>
+        <w:tc>
+          <w:tcPr>
+            <w:tcW w:w="1699" w:type="dxa"/>
+          </w:tcPr>
+          <w:p>
+            <w:pPr>
+              <w:jc w:val="center"/>
+              <w:rPr>
+                <w:lang w:val="en-GB"/>
+              </w:rPr>
+            </w:pPr>
+            <w:proofErr w:type="spellStart"/>
+            <w:proofErr w:type="gramStart"/>
+            <w:r>
+              <w:t>Cluster</w:t>
+            </w:r>
+            <w:proofErr w:type="spellEnd"/>
+            <w:proofErr w:type="gramEnd"/>
+            <w:r>
+              <w:t xml:space="preserve"> 1</w:t>
+            </w:r>
+          </w:p>
+        </w:tc>
+        <w:tc>
+          <w:tcPr>
+            <w:tcW w:w="1699" w:type="dxa"/>
+          </w:tcPr>
+          <w:p>
+            <w:pPr>
+              <w:jc w:val="center"/>
+              <w:rPr>
+                <w:lang w:val="en-GB"/>
+              </w:rPr>
+            </w:pPr>
+            <w:proofErr w:type="spellStart"/>
+            <w:proofErr w:type="gramStart"/>
+            <w:r>
+              <w:t>Cluster</w:t>
+            </w:r>
+            <w:proofErr w:type="spellEnd"/>
+            <w:proofErr w:type="gramEnd"/>
+            <w:r>
+              <w:t xml:space="preserve"> </w:t>
+            </w:r>
+            <w:r>
+              <w:t>2</w:t>
+            </w:r>
+          </w:p>
+        </w:tc>
+        <w:tc>
+          <w:tcPr>
+            <w:tcW w:w="1699" w:type="dxa"/>
+          </w:tcPr>
+          <w:p>
+            <w:pPr>
+              <w:jc w:val="center"/>
+              <w:rPr>
+                <w:lang w:val="en-GB"/>
+              </w:rPr>
+            </w:pPr>
+            <w:proofErr w:type="spellStart"/>
+            <w:proofErr w:type="gramStart"/>
+            <w:r>
+              <w:t>Cluster</w:t>
+            </w:r>
+            <w:proofErr w:type="spellEnd"/>
+            <w:proofErr w:type="gramEnd"/>
+            <w:r>
+              <w:t xml:space="preserve"> </w:t>
+            </w:r>
+            <w:r>
+              <w:t>3</w:t>
+            </w:r>
+          </w:p>
+        </w:tc>
+        <w:tc>
+          <w:tcPr>
+            <w:tcW w:w="1699" w:type="dxa"/>
+          </w:tcPr>
+          <w:p>
+            <w:pPr>
+              <w:jc w:val="center"/>
+              <w:rPr>
+                <w:lang w:val="en-GB"/>
+              </w:rPr>
+            </w:pPr>
+            <w:proofErr w:type="spellStart"/>
+            <w:proofErr w:type="gramStart"/>
+            <w:r>
+              <w:t>Cluster</w:t>
+            </w:r>
+            <w:proofErr w:type="spellEnd"/>
+            <w:proofErr w:type="gramEnd"/>
+            <w:r>
+              <w:t xml:space="preserve"> </w:t>
+            </w:r>
+            <w:r>
+              <w:t>4</w:t>
+            </w:r>
+          </w:p>
+        </w:tc>
+      </w:tr>
+      <w:tr>
+        <w:tc>
+          <w:tcPr>
+            <w:tcW w:w="1698" w:type="dxa"/>
+          </w:tcPr>
+          <w:p>
+            <w:pPr>
+              <w:jc w:val="center"/>
+              <w:rPr>
+                <w:lang w:val="en-GB"/>
+              </w:rPr>
+            </w:pPr>
+            <w:proofErr w:type="spellStart"/>
+            <w:proofErr w:type="gramStart"/>
+            <w:r>
+              <w:t>Cluster</w:t>
+            </w:r>
+            <w:proofErr w:type="spellEnd"/>
+            <w:proofErr w:type="gramEnd"/>
+            <w:r>
+              <w:t xml:space="preserve"> 1</w:t>
+            </w:r>
+          </w:p>
+        </w:tc>
+        <w:tc>
+          <w:tcPr>
+            <w:tcW w:w="1699" w:type="dxa"/>
+          </w:tcPr>
+          <w:p>
+            <w:pPr>
+              <w:jc w:val="center"/>
+              <w:rPr>
+                <w:lang w:val="en-GB"/>
+              </w:rPr>
+            </w:pPr>
+            <w:r>
+              <w:rPr>
+                <w:lang w:val="en-GB"/>
+              </w:rPr>
+              <w:t>15</w:t>
+            </w:r>
+          </w:p>
+        </w:tc>
+        <w:tc>
+          <w:tcPr>
+            <w:tcW w:w="1699" w:type="dxa"/>
+          </w:tcPr>
+          <w:p>
+            <w:pPr>
+              <w:jc w:val="center"/>
+              <w:rPr>
+                <w:lang w:val="en-GB"/>
+              </w:rPr>
+            </w:pPr>
+            <w:r>
+              <w:rPr>
+                <w:lang w:val="en-GB"/>
+              </w:rPr>
+              <w:t>6</w:t>
+            </w:r>
+          </w:p>
+        </w:tc>
+        <w:tc>
+          <w:tcPr>
+            <w:tcW w:w="1699" w:type="dxa"/>
+          </w:tcPr>
+          <w:p>
+            <w:pPr>
+              <w:jc w:val="center"/>
+              <w:rPr>
+                <w:lang w:val="en-GB"/>
+              </w:rPr>
+            </w:pPr>
+            <w:r>
+              <w:rPr>
+                <w:lang w:val="en-GB"/>
+              </w:rPr>
+              <w:t>1</w:t>
+            </w:r>
+          </w:p>
+        </w:tc>
+        <w:tc>
+          <w:tcPr>
+            <w:tcW w:w="1699" w:type="dxa"/>
+          </w:tcPr>
+          <w:p>
+            <w:pPr>
+              <w:jc w:val="center"/>
+              <w:rPr>
+                <w:lang w:val="en-GB"/>
+              </w:rPr>
+            </w:pPr>
+            <w:r>
+              <w:rPr>
+                <w:lang w:val="en-GB"/>
+              </w:rPr>
+              <w:t>6</w:t>
+            </w:r>
+          </w:p>
+        </w:tc>
+      </w:tr>
+      <w:tr>
+        <w:tc>
+          <w:tcPr>
+            <w:tcW w:w="1698" w:type="dxa"/>
+          </w:tcPr>
+          <w:p>
+            <w:pPr>
+              <w:jc w:val="center"/>
+              <w:rPr>
+                <w:lang w:val="en-GB"/>
+              </w:rPr>
+            </w:pPr>
+            <w:proofErr w:type="spellStart"/>
+            <w:proofErr w:type="gramStart"/>
+            <w:r>
+              <w:t>Cluster</w:t>
+            </w:r>
+            <w:proofErr w:type="spellEnd"/>
+            <w:proofErr w:type="gramEnd"/>
+            <w:r>
+              <w:t xml:space="preserve"> </w:t>
+            </w:r>
+            <w:r>
+              <w:t>2</w:t>
+            </w:r>
+          </w:p>
+        </w:tc>
+        <w:tc>
+          <w:tcPr>
+            <w:tcW w:w="1699" w:type="dxa"/>
+          </w:tcPr>
+          <w:p>
+            <w:pPr>
+              <w:jc w:val="center"/>
+              <w:rPr>
+                <w:lang w:val="en-GB"/>
+              </w:rPr>
+            </w:pPr>
+            <w:r>
+              <w:rPr>
+                <w:lang w:val="en-GB"/>
+              </w:rPr>
+              <w:t>0</w:t>
+            </w:r>
+          </w:p>
+        </w:tc>
+        <w:tc>
+          <w:tcPr>
+            <w:tcW w:w="1699" w:type="dxa"/>
+          </w:tcPr>
+          <w:p>
+            <w:pPr>
+              <w:jc w:val="center"/>
+              <w:rPr>
+                <w:lang w:val="en-GB"/>
+              </w:rPr>
+            </w:pPr>
+            <w:r>
+              <w:rPr>
+                <w:lang w:val="en-GB"/>
+              </w:rPr>
+              <w:t>0</w:t>
+            </w:r>
+          </w:p>
+        </w:tc>
+        <w:tc>
+          <w:tcPr>
+            <w:tcW w:w="1699" w:type="dxa"/>
+          </w:tcPr>
+          <w:p>
+            <w:pPr>
+              <w:jc w:val="center"/>
+              <w:rPr>
+                <w:lang w:val="en-GB"/>
+              </w:rPr>
+            </w:pPr>
+            <w:r>
+              <w:rPr>
+                <w:lang w:val="en-GB"/>
+              </w:rPr>
+              <w:t>7</w:t>
+            </w:r>
+          </w:p>
+        </w:tc>
+        <w:tc>
+          <w:tcPr>
+            <w:tcW w:w="1699" w:type="dxa"/>
+          </w:tcPr>
+          <w:p>
+            <w:pPr>
+              <w:jc w:val="center"/>
+              <w:rPr>
+                <w:lang w:val="en-GB"/>
+              </w:rPr>
+            </w:pPr>
+            <w:r>
+              <w:rPr>
+                <w:lang w:val="en-GB"/>
+              </w:rPr>
+              <w:t>0</w:t>
+            </w:r>
+          </w:p>
+        </w:tc>
+      </w:tr>
+      <w:tr>
+        <w:tc>
+          <w:tcPr>
+            <w:tcW w:w="1698" w:type="dxa"/>
+          </w:tcPr>
+          <w:p>
+            <w:pPr>
+              <w:jc w:val="center"/>
+              <w:rPr>
+                <w:lang w:val="en-GB"/>
+              </w:rPr>
+            </w:pPr>
+            <w:proofErr w:type="spellStart"/>
+            <w:proofErr w:type="gramStart"/>
+            <w:r>
+              <w:t>Cluster</w:t>
+            </w:r>
+            <w:proofErr w:type="spellEnd"/>
+            <w:proofErr w:type="gramEnd"/>
+            <w:r>
+              <w:t xml:space="preserve"> </w:t>
+            </w:r>
+            <w:r>
+              <w:t>3</w:t>
+            </w:r>
+          </w:p>
+        </w:tc>
+        <w:tc>
+          <w:tcPr>
+            <w:tcW w:w="1699" w:type="dxa"/>
+          </w:tcPr>
+          <w:p>
+            <w:pPr>
+              <w:jc w:val="center"/>
+              <w:rPr>
+                <w:lang w:val="en-GB"/>
+              </w:rPr>
+            </w:pPr>
+            <w:r>
+              <w:rPr>
+                <w:lang w:val="en-GB"/>
+              </w:rPr>
+              <w:t>0</w:t>
+            </w:r>
+          </w:p>
+        </w:tc>
+        <w:tc>
+          <w:tcPr>
+            <w:tcW w:w="1699" w:type="dxa"/>
+          </w:tcPr>
+          <w:p>
+            <w:pPr>
+              <w:jc w:val="center"/>
+              <w:rPr>
+                <w:lang w:val="en-GB"/>
+              </w:rPr>
+            </w:pPr>
+            <w:r>
+              <w:rPr>
+                <w:lang w:val="en-GB"/>
+              </w:rPr>
+              <w:t>0</w:t>
+            </w:r>
+          </w:p>
+        </w:tc>
+        <w:tc>
+          <w:tcPr>
+            <w:tcW w:w="1699" w:type="dxa"/>
+          </w:tcPr>
+          <w:p>
+            <w:pPr>
+              <w:jc w:val="center"/>
+              <w:rPr>
+                <w:lang w:val="en-GB"/>
+              </w:rPr>
+            </w:pPr>
+            <w:r>
+              <w:rPr>
+                <w:lang w:val="en-GB"/>
+              </w:rPr>
+              <w:t>4</w:t>
+            </w:r>
+          </w:p>
+        </w:tc>
+        <w:tc>
+          <w:tcPr>
+            <w:tcW w:w="1699" w:type="dxa"/>
+          </w:tcPr>
+          <w:p>
+            <w:pPr>
+              <w:jc w:val="center"/>
+              <w:rPr>
+                <w:lang w:val="en-GB"/>
+              </w:rPr>
+            </w:pPr>
+            <w:r>
+              <w:rPr>
+                <w:lang w:val="en-GB"/>
+              </w:rPr>
+              <w:t>0</w:t>
+            </w:r>
+          </w:p>
+        </w:tc>
+      </w:tr>
+      <w:tr>
+        <w:tc>
+          <w:tcPr>
+            <w:tcW w:w="1698" w:type="dxa"/>
+          </w:tcPr>
+          <w:p>
+            <w:pPr>
+              <w:jc w:val="center"/>
+              <w:rPr>
+                <w:lang w:val="en-GB"/>
+              </w:rPr>
+            </w:pPr>
+            <w:proofErr w:type="spellStart"/>
+            <w:proofErr w:type="gramStart"/>
+            <w:r>
+              <w:t>Cluster</w:t>
+            </w:r>
+            <w:proofErr w:type="spellEnd"/>
+            <w:proofErr w:type="gramEnd"/>
+            <w:r>
+              <w:t xml:space="preserve"> </w:t>
+            </w:r>
+            <w:r>
+              <w:t>4</w:t>
+            </w:r>
+          </w:p>
+        </w:tc>
+        <w:tc>
+          <w:tcPr>
+            <w:tcW w:w="1699" w:type="dxa"/>
+          </w:tcPr>
+          <w:p>
+            <w:pPr>
+              <w:jc w:val="center"/>
+              <w:rPr>
+                <w:lang w:val="en-GB"/>
+              </w:rPr>
+            </w:pPr>
+            <w:r>
+              <w:rPr>
+                <w:lang w:val="en-GB"/>
+              </w:rPr>
+              <w:t>0</w:t>
+            </w:r>
+          </w:p>
+        </w:tc>
+        <w:tc>
+          <w:tcPr>
+            <w:tcW w:w="1699" w:type="dxa"/>
+          </w:tcPr>
+          <w:p>
+            <w:pPr>
+              <w:jc w:val="center"/>
+              <w:rPr>
+                <w:lang w:val="en-GB"/>
+              </w:rPr>
+            </w:pPr>
+            <w:r>
+              <w:rPr>
+                <w:lang w:val="en-GB"/>
+              </w:rPr>
+              <w:t>0</w:t>
+            </w:r>
+          </w:p>
+        </w:tc>
+        <w:tc>
+          <w:tcPr>
+            <w:tcW w:w="1699" w:type="dxa"/>
+          </w:tcPr>
+          <w:p>
+            <w:pPr>
+              <w:jc w:val="center"/>
+              <w:rPr>
+                <w:lang w:val="en-GB"/>
+              </w:rPr>
+            </w:pPr>
+            <w:r>
+              <w:rPr>
+                <w:lang w:val="en-GB"/>
+              </w:rPr>
+              <w:t>2</w:t>
+            </w:r>
+          </w:p>
+        </w:tc>
+        <w:tc>
+          <w:tcPr>
+            <w:tcW w:w="1699" w:type="dxa"/>
+          </w:tcPr>
+          <w:p>
+            <w:pPr>
+              <w:jc w:val="center"/>
+              <w:rPr>
+                <w:lang w:val="en-GB"/>
+              </w:rPr>
+            </w:pPr>
+            <w:r>
+              <w:rPr>
+                <w:lang w:val="en-GB"/>
+              </w:rPr>
+              <w:t>0</w:t>
+            </w:r>
+          </w:p>
+        </w:tc>
+      </w:tr>
+      <w:tr>
+        <w:tc>
+          <w:tcPr>
+            <w:tcW w:w="1698" w:type="dxa"/>
+          </w:tcPr>
+          <w:p>
+            <w:pPr>
+              <w:jc w:val="center"/>
+              <w:rPr>
+                <w:lang w:val="en-GB"/>
+              </w:rPr>
+            </w:pPr>
+            <w:proofErr w:type="spellStart"/>
+            <w:proofErr w:type="gramStart"/>
+            <w:r>
+              <w:t>Cluster</w:t>
+            </w:r>
+            <w:proofErr w:type="spellEnd"/>
+            <w:proofErr w:type="gramEnd"/>
+            <w:r>
+              <w:t xml:space="preserve"> </w:t>
+            </w:r>
+            <w:r>
+              <w:t>5</w:t>
+            </w:r>
+          </w:p>
+        </w:tc>
+        <w:tc>
+          <w:tcPr>
+            <w:tcW w:w="1699" w:type="dxa"/>
+          </w:tcPr>
+          <w:p>
+            <w:pPr>
+              <w:jc w:val="center"/>
+              <w:rPr>
+                <w:lang w:val="en-GB"/>
+              </w:rPr>
+            </w:pPr>
+            <w:r>
+              <w:rPr>
+                <w:lang w:val="en-GB"/>
+              </w:rPr>
+              <w:t>0</w:t>
+            </w:r>
+          </w:p>
+        </w:tc>
+        <w:tc>
+          <w:tcPr>
+            <w:tcW w:w="1699" w:type="dxa"/>
+          </w:tcPr>
+          <w:p>
+            <w:pPr>
+              <w:jc w:val="center"/>
+              <w:rPr>
+                <w:lang w:val="en-GB"/>
+              </w:rPr>
+            </w:pPr>
+            <w:r>
+              <w:rPr>
+                <w:lang w:val="en-GB"/>
+              </w:rPr>
+              <w:t>0</w:t>
+            </w:r>
+          </w:p>
+        </w:tc>
+        <w:tc>
+          <w:tcPr>
+            <w:tcW w:w="1699" w:type="dxa"/>
+          </w:tcPr>
+          <w:p>
+            <w:pPr>
+              <w:jc w:val="center"/>
+              <w:rPr>
+                <w:lang w:val="en-GB"/>
+              </w:rPr>
+            </w:pPr>
+            <w:r>
+              <w:rPr>
+                <w:lang w:val="en-GB"/>
+              </w:rPr>
+              <w:t>1</w:t>
+            </w:r>
+          </w:p>
+        </w:tc>
+        <w:tc>
+          <w:tcPr>
+            <w:tcW w:w="1699" w:type="dxa"/>
+          </w:tcPr>
+          <w:p>
+            <w:pPr>
+              <w:jc w:val="center"/>
+              <w:rPr>
+                <w:lang w:val="en-GB"/>
+              </w:rPr>
+            </w:pPr>
+            <w:r>
+              <w:rPr>
+                <w:lang w:val="en-GB"/>
+              </w:rPr>
+              <w:t>0</w:t>
+            </w:r>
+          </w:p>
+        </w:tc>
+      </w:tr>
+    </w:tbl>
+    <w:p>
       <w:pPr>
-        <w:jc w:val="both"/>
+        <w:jc w:val="center"/>
+        <w:rPr>
+          <w:lang w:val="en-GB"/>
+        </w:rPr>
       </w:pPr>
-      <w:r>
-        <w:t xml:space="preserve">Aun con estas diferencias metodológicas, se observan notables coincidencias en los patrones generales de agrupación. En ambos modelos aparecen grupos de investigadores fuertemente centrados en temáticas similares, y en varios casos, los </w:t>
-      </w:r>
-      <w:proofErr w:type="spellStart"/>
-      <w:proofErr w:type="gramStart"/>
-      <w:r>
-        <w:t>clusters</w:t>
-      </w:r>
-      <w:proofErr w:type="spellEnd"/>
-      <w:proofErr w:type="gramEnd"/>
-      <w:r>
-        <w:t xml:space="preserve"> del modelo UMAP pueden interpretarse como fusiones o simplificaciones de grupos más específicos detectados por el modelo Manhattan.</w:t>
-      </w:r>
     </w:p>
     <w:p>
-      <w:r>
-        <w:br w:type="page"/>
+      <w:pPr>
+        <w:rPr>
+          <w:lang w:val="en-GB"/>
+        </w:rPr>
+      </w:pPr>
+      <w:r>
+        <w:rPr>
+          <w:lang w:val="en-GB"/>
+        </w:rPr>
+        <w:drawing>
+          <wp:inline distT="0" distB="0" distL="0" distR="0" wp14:anchorId="36BFA549" wp14:editId="33C29819">
+            <wp:extent cx="5417389" cy="2927837"/>
+            <wp:effectExtent l="0" t="0" r="0" b="6350"/>
+            <wp:docPr id="734069562" name="Imagen 1" descr="Gráfico&#10;&#10;El contenido generado por IA puede ser incorrecto."/>
+            <wp:cNvGraphicFramePr>
+              <a:graphicFrameLocks xmlns:a="http://schemas.openxmlformats.org/drawingml/2006/main" noChangeAspect="1"/>
+            </wp:cNvGraphicFramePr>
+            <a:graphic xmlns:a="http://schemas.openxmlformats.org/drawingml/2006/main">
+              <a:graphicData uri="http://schemas.openxmlformats.org/drawingml/2006/picture">
+                <pic:pic xmlns:pic="http://schemas.openxmlformats.org/drawingml/2006/picture">
+                  <pic:nvPicPr>
+                    <pic:cNvPr id="734069562" name="Imagen 1" descr="Gráfico&#10;&#10;El contenido generado por IA puede ser incorrecto."/>
+                    <pic:cNvPicPr/>
+                  </pic:nvPicPr>
+                  <pic:blipFill>
+                    <a:blip r:embed="rId7"/>
+                    <a:stretch>
+                      <a:fillRect/>
+                    </a:stretch>
+                  </pic:blipFill>
+                  <pic:spPr>
+                    <a:xfrm>
+                      <a:off x="0" y="0"/>
+                      <a:ext cx="5420491" cy="2929513"/>
+                    </a:xfrm>
+                    <a:prstGeom prst="rect">
+                      <a:avLst/>
+                    </a:prstGeom>
+                  </pic:spPr>
+                </pic:pic>
+              </a:graphicData>
+            </a:graphic>
+          </wp:inline>
+        </w:drawing>
+      </w:r>
+      <w:r>
+        <w:rPr>
+          <w:lang w:val="en-GB"/>
+        </w:rPr>
+        <w:br/>
       </w:r>
     </w:p>
     <w:p>
@@ -630,23 +1333,27 @@
       </w:pPr>
       <w:r>
         <w:lastRenderedPageBreak/>
-        <w:t xml:space="preserve">Por ejemplo, examinando en detalle los </w:t>
+        <w:t xml:space="preserve">Para evaluar si los modelos con UMAP y sin UMAP capturan una estructura común en los datos, se compararon los investigadores asignados a cada </w:t>
       </w:r>
       <w:proofErr w:type="spellStart"/>
       <w:proofErr w:type="gramStart"/>
       <w:r>
+        <w:t>cluster</w:t>
+      </w:r>
+      <w:proofErr w:type="spellEnd"/>
+      <w:proofErr w:type="gramEnd"/>
+      <w:r>
+        <w:t xml:space="preserve"> en ambos métodos mediante una matriz de solapamiento. Si ambos modelos hubieran identificado una estructura temática robusta, sería esperable que la mayoría de </w:t>
+      </w:r>
+      <w:proofErr w:type="spellStart"/>
+      <w:proofErr w:type="gramStart"/>
+      <w:r>
         <w:t>clusters</w:t>
       </w:r>
       <w:proofErr w:type="spellEnd"/>
       <w:proofErr w:type="gramEnd"/>
       <w:r>
-        <w:t xml:space="preserve"> correspondientes de ambas técnicas, se aprecia que ciertos grupos del modelo Manhattan</w:t>
-      </w:r>
-      <w:r>
-        <w:t xml:space="preserve">, </w:t>
-      </w:r>
-      <w:r>
-        <w:t xml:space="preserve">encuentran correspondencia directa en alguno de los </w:t>
+        <w:t xml:space="preserve"> de un modelo se correspondieran claramente con uno o varios </w:t>
       </w:r>
       <w:proofErr w:type="spellStart"/>
       <w:proofErr w:type="gramStart"/>
@@ -656,13 +1363,34 @@
       <w:proofErr w:type="spellEnd"/>
       <w:proofErr w:type="gramEnd"/>
       <w:r>
-        <w:t xml:space="preserve"> del modelo UMAP. La diferencia radica principalmente en el nivel de granularidad: mientras el modelo Manhattan tiende a separar de manera más estricta subcampos afines</w:t>
-      </w:r>
-      <w:r>
-        <w:t xml:space="preserve">, </w:t>
-      </w:r>
-      <w:r>
-        <w:t>el modelo UMAP tiende a fusionarlos dentro de un mismo grupo debido a que su representación no lineal prioriza la forma global del espacio temático antes que las distinciones locales.</w:t>
+        <w:t xml:space="preserve"> del otro.</w:t>
+      </w:r>
+    </w:p>
+    <w:p>
+      <w:pPr>
+        <w:tabs>
+          <w:tab w:val="num" w:pos="720"/>
+        </w:tabs>
+        <w:jc w:val="both"/>
+      </w:pPr>
+      <w:r>
+        <w:t>Sin embargo, los resultados muestran que</w:t>
+      </w:r>
+      <w:r>
+        <w:t xml:space="preserve"> ú</w:t>
+      </w:r>
+      <w:r>
+        <w:t xml:space="preserve">nicamente el Clúster 1 del modelo sin UMAP presenta cierto grado de correspondencia con varios </w:t>
+      </w:r>
+      <w:proofErr w:type="spellStart"/>
+      <w:proofErr w:type="gramStart"/>
+      <w:r>
+        <w:t>clusters</w:t>
+      </w:r>
+      <w:proofErr w:type="spellEnd"/>
+      <w:proofErr w:type="gramEnd"/>
+      <w:r>
+        <w:t xml:space="preserve"> del modelo UMAP (15, 6 y 6 coincidencias), lo que indica una partición diferente del mismo grupo de investigadores.</w:t>
       </w:r>
     </w:p>
     <w:p>
@@ -670,7 +1398,7 @@
         <w:jc w:val="both"/>
       </w:pPr>
       <w:r>
-        <w:t xml:space="preserve">De igual manera, algunos </w:t>
+        <w:t xml:space="preserve">El resto de </w:t>
       </w:r>
       <w:proofErr w:type="spellStart"/>
       <w:proofErr w:type="gramStart"/>
@@ -680,25 +1408,33 @@
       <w:proofErr w:type="spellEnd"/>
       <w:proofErr w:type="gramEnd"/>
       <w:r>
-        <w:t xml:space="preserve"> del modelo </w:t>
-      </w:r>
-      <w:proofErr w:type="spellStart"/>
-      <w:r>
-        <w:t>JerMan</w:t>
-      </w:r>
-      <w:proofErr w:type="spellEnd"/>
-      <w:r>
-        <w:t xml:space="preserve"> que agrupaban temáticas relativamente próximas —como matemáticas aplicadas, modelización o métodos numéricos— aparecen amalgamados en un único </w:t>
+        <w:t xml:space="preserve"> del modelo sin UMAP solo coincide de forma muy débil con alguno de los </w:t>
       </w:r>
       <w:proofErr w:type="spellStart"/>
       <w:proofErr w:type="gramStart"/>
       <w:r>
-        <w:t>cluster</w:t>
+        <w:t>clusters</w:t>
       </w:r>
       <w:proofErr w:type="spellEnd"/>
       <w:proofErr w:type="gramEnd"/>
       <w:r>
-        <w:t xml:space="preserve"> dentro del modelo UMAP. Esta fusión no indica pérdida de información, sino que revela una estructura temática más suavizada en la representación UMAP, que identifica estas líneas de trabajo como parte de una misma región conceptual del espacio de investigación.</w:t>
+        <w:t xml:space="preserve"> del modelo UMAP (7, 4, 2 o 1 coincidencia).</w:t>
+      </w:r>
+      <w:r>
+        <w:t xml:space="preserve"> </w:t>
+      </w:r>
+      <w:r>
+        <w:t xml:space="preserve">No existe una alineación clara entre </w:t>
+      </w:r>
+      <w:proofErr w:type="spellStart"/>
+      <w:proofErr w:type="gramStart"/>
+      <w:r>
+        <w:t>clusters</w:t>
+      </w:r>
+      <w:proofErr w:type="spellEnd"/>
+      <w:proofErr w:type="gramEnd"/>
+      <w:r>
+        <w:t xml:space="preserve"> de ambos modelos, ni una correspondencia que permita establecer equivalencias entre sus agrupaciones.</w:t>
       </w:r>
     </w:p>
     <w:p>
@@ -706,27 +1442,730 @@
         <w:jc w:val="both"/>
       </w:pPr>
       <w:r>
-        <w:t xml:space="preserve">Por otro lado, se detectan también ciertas diferencias relevantes. El modelo Manhattan, al generar cinco </w:t>
+        <w:t xml:space="preserve">En conjunto, estos resultados indican que los dos enfoques de </w:t>
+      </w:r>
+      <w:proofErr w:type="spellStart"/>
+      <w:r>
+        <w:t>clustering</w:t>
+      </w:r>
+      <w:proofErr w:type="spellEnd"/>
+      <w:r>
+        <w:t xml:space="preserve"> no están identificando la misma estructura subyacente en los datos. Esto sugiere que los temas preferidos de publicación no contienen una estructura de agrupamiento suficientemente fuerte o estable como para ser capturada de forma consistente por distintos métodos de reducción dimensional y </w:t>
+      </w:r>
+      <w:proofErr w:type="spellStart"/>
+      <w:r>
+        <w:t>clustering</w:t>
+      </w:r>
+      <w:proofErr w:type="spellEnd"/>
+      <w:r>
+        <w:t xml:space="preserve">. Cada modelo genera agrupaciones diferentes, por lo que no se puede afirmar que exista una segmentación temática robusta entre los investigadores del IUMPA basada únicamente en sus </w:t>
+      </w:r>
+      <w:proofErr w:type="spellStart"/>
+      <w:r>
+        <w:t>keywords</w:t>
+      </w:r>
+      <w:proofErr w:type="spellEnd"/>
+      <w:r>
+        <w:t xml:space="preserve"> asociadas.</w:t>
+      </w:r>
+    </w:p>
+    <w:p>
+      <w:r>
+        <w:t xml:space="preserve">Igualmente, aquí se muestran los resultados de aplicar este mismo solapamiento de </w:t>
       </w:r>
       <w:proofErr w:type="spellStart"/>
       <w:proofErr w:type="gramStart"/>
       <w:r>
+        <w:t>clust</w:t>
+      </w:r>
+      <w:r>
+        <w:t>ers</w:t>
+      </w:r>
+      <w:proofErr w:type="spellEnd"/>
+      <w:proofErr w:type="gramEnd"/>
+      <w:r>
+        <w:t xml:space="preserve"> a partir de las </w:t>
+      </w:r>
+      <w:proofErr w:type="spellStart"/>
+      <w:r>
+        <w:t>keywords</w:t>
+      </w:r>
+      <w:proofErr w:type="spellEnd"/>
+      <w:r>
+        <w:t xml:space="preserve"> (si aparecen o no), junto a un top de las palabras que más se repiten en cada uno de los </w:t>
+      </w:r>
+      <w:proofErr w:type="spellStart"/>
+      <w:proofErr w:type="gramStart"/>
+      <w:r>
         <w:t>clusters</w:t>
       </w:r>
       <w:proofErr w:type="spellEnd"/>
       <w:proofErr w:type="gramEnd"/>
       <w:r>
-        <w:t xml:space="preserve">, captura divisiones sutiles que UMAP no reproduce directamente, lo cual sugiere que parte de la variabilidad temática entre investigadores ocurre en dimensiones que UMAP considera menos relevantes para la estructura global. Este fenómeno es habitual en técnicas no lineales: al priorizar la preservación de relaciones de vecindad más fuertes, tienden a interpretarse como “ruido” las diferenciaciones menores, que terminan absorbiéndose en un </w:t>
-      </w:r>
-      <w:proofErr w:type="spellStart"/>
-      <w:proofErr w:type="gramStart"/>
-      <w:r>
-        <w:t>cluster</w:t>
-      </w:r>
-      <w:proofErr w:type="spellEnd"/>
-      <w:proofErr w:type="gramEnd"/>
-      <w:r>
-        <w:t xml:space="preserve"> más amplio.</w:t>
+        <w:t>:</w:t>
+      </w:r>
+    </w:p>
+    <w:tbl>
+      <w:tblPr>
+        <w:tblStyle w:val="Tablaconcuadrcula"/>
+        <w:tblW w:w="0" w:type="auto"/>
+        <w:tblLook w:val="04A0" w:firstRow="1" w:lastRow="0" w:firstColumn="1" w:lastColumn="0" w:noHBand="0" w:noVBand="1"/>
+      </w:tblPr>
+      <w:tblGrid>
+        <w:gridCol w:w="1698"/>
+        <w:gridCol w:w="1699"/>
+        <w:gridCol w:w="1699"/>
+        <w:gridCol w:w="1699"/>
+        <w:gridCol w:w="1699"/>
+      </w:tblGrid>
+      <w:tr>
+        <w:tc>
+          <w:tcPr>
+            <w:tcW w:w="1698" w:type="dxa"/>
+          </w:tcPr>
+          <w:p>
+            <w:pPr>
+              <w:jc w:val="center"/>
+            </w:pPr>
+          </w:p>
+        </w:tc>
+        <w:tc>
+          <w:tcPr>
+            <w:tcW w:w="1699" w:type="dxa"/>
+          </w:tcPr>
+          <w:p>
+            <w:pPr>
+              <w:jc w:val="center"/>
+              <w:rPr>
+                <w:lang w:val="en-GB"/>
+              </w:rPr>
+            </w:pPr>
+            <w:proofErr w:type="spellStart"/>
+            <w:proofErr w:type="gramStart"/>
+            <w:r>
+              <w:t>Cluster</w:t>
+            </w:r>
+            <w:proofErr w:type="spellEnd"/>
+            <w:proofErr w:type="gramEnd"/>
+            <w:r>
+              <w:t xml:space="preserve"> 1</w:t>
+            </w:r>
+          </w:p>
+        </w:tc>
+        <w:tc>
+          <w:tcPr>
+            <w:tcW w:w="1699" w:type="dxa"/>
+          </w:tcPr>
+          <w:p>
+            <w:pPr>
+              <w:jc w:val="center"/>
+              <w:rPr>
+                <w:lang w:val="en-GB"/>
+              </w:rPr>
+            </w:pPr>
+            <w:proofErr w:type="spellStart"/>
+            <w:proofErr w:type="gramStart"/>
+            <w:r>
+              <w:t>Cluster</w:t>
+            </w:r>
+            <w:proofErr w:type="spellEnd"/>
+            <w:proofErr w:type="gramEnd"/>
+            <w:r>
+              <w:t xml:space="preserve"> 2</w:t>
+            </w:r>
+          </w:p>
+        </w:tc>
+        <w:tc>
+          <w:tcPr>
+            <w:tcW w:w="1699" w:type="dxa"/>
+          </w:tcPr>
+          <w:p>
+            <w:pPr>
+              <w:jc w:val="center"/>
+              <w:rPr>
+                <w:lang w:val="en-GB"/>
+              </w:rPr>
+            </w:pPr>
+            <w:proofErr w:type="spellStart"/>
+            <w:proofErr w:type="gramStart"/>
+            <w:r>
+              <w:t>Cluster</w:t>
+            </w:r>
+            <w:proofErr w:type="spellEnd"/>
+            <w:proofErr w:type="gramEnd"/>
+            <w:r>
+              <w:t xml:space="preserve"> 3</w:t>
+            </w:r>
+          </w:p>
+        </w:tc>
+        <w:tc>
+          <w:tcPr>
+            <w:tcW w:w="1699" w:type="dxa"/>
+          </w:tcPr>
+          <w:p>
+            <w:pPr>
+              <w:jc w:val="center"/>
+              <w:rPr>
+                <w:lang w:val="en-GB"/>
+              </w:rPr>
+            </w:pPr>
+            <w:proofErr w:type="spellStart"/>
+            <w:proofErr w:type="gramStart"/>
+            <w:r>
+              <w:t>Cluster</w:t>
+            </w:r>
+            <w:proofErr w:type="spellEnd"/>
+            <w:proofErr w:type="gramEnd"/>
+            <w:r>
+              <w:t xml:space="preserve"> 4</w:t>
+            </w:r>
+          </w:p>
+        </w:tc>
+      </w:tr>
+      <w:tr>
+        <w:tc>
+          <w:tcPr>
+            <w:tcW w:w="1698" w:type="dxa"/>
+          </w:tcPr>
+          <w:p>
+            <w:pPr>
+              <w:jc w:val="center"/>
+              <w:rPr>
+                <w:lang w:val="en-GB"/>
+              </w:rPr>
+            </w:pPr>
+            <w:proofErr w:type="spellStart"/>
+            <w:proofErr w:type="gramStart"/>
+            <w:r>
+              <w:t>Cluster</w:t>
+            </w:r>
+            <w:proofErr w:type="spellEnd"/>
+            <w:proofErr w:type="gramEnd"/>
+            <w:r>
+              <w:t xml:space="preserve"> 1</w:t>
+            </w:r>
+          </w:p>
+        </w:tc>
+        <w:tc>
+          <w:tcPr>
+            <w:tcW w:w="1699" w:type="dxa"/>
+          </w:tcPr>
+          <w:p>
+            <w:pPr>
+              <w:jc w:val="center"/>
+              <w:rPr>
+                <w:lang w:val="en-GB"/>
+              </w:rPr>
+            </w:pPr>
+            <w:r>
+              <w:rPr>
+                <w:lang w:val="en-GB"/>
+              </w:rPr>
+              <w:t>272</w:t>
+            </w:r>
+          </w:p>
+        </w:tc>
+        <w:tc>
+          <w:tcPr>
+            <w:tcW w:w="1699" w:type="dxa"/>
+          </w:tcPr>
+          <w:p>
+            <w:pPr>
+              <w:jc w:val="center"/>
+              <w:rPr>
+                <w:lang w:val="en-GB"/>
+              </w:rPr>
+            </w:pPr>
+            <w:r>
+              <w:rPr>
+                <w:lang w:val="en-GB"/>
+              </w:rPr>
+              <w:t>205</w:t>
+            </w:r>
+          </w:p>
+        </w:tc>
+        <w:tc>
+          <w:tcPr>
+            <w:tcW w:w="1699" w:type="dxa"/>
+          </w:tcPr>
+          <w:p>
+            <w:pPr>
+              <w:jc w:val="center"/>
+              <w:rPr>
+                <w:lang w:val="en-GB"/>
+              </w:rPr>
+            </w:pPr>
+            <w:r>
+              <w:rPr>
+                <w:lang w:val="en-GB"/>
+              </w:rPr>
+              <w:t>365</w:t>
+            </w:r>
+          </w:p>
+        </w:tc>
+        <w:tc>
+          <w:tcPr>
+            <w:tcW w:w="1699" w:type="dxa"/>
+          </w:tcPr>
+          <w:p>
+            <w:pPr>
+              <w:jc w:val="center"/>
+              <w:rPr>
+                <w:lang w:val="en-GB"/>
+              </w:rPr>
+            </w:pPr>
+            <w:r>
+              <w:rPr>
+                <w:lang w:val="en-GB"/>
+              </w:rPr>
+              <w:t>177</w:t>
+            </w:r>
+          </w:p>
+        </w:tc>
+      </w:tr>
+      <w:tr>
+        <w:tc>
+          <w:tcPr>
+            <w:tcW w:w="1698" w:type="dxa"/>
+          </w:tcPr>
+          <w:p>
+            <w:pPr>
+              <w:jc w:val="center"/>
+              <w:rPr>
+                <w:lang w:val="en-GB"/>
+              </w:rPr>
+            </w:pPr>
+            <w:proofErr w:type="spellStart"/>
+            <w:proofErr w:type="gramStart"/>
+            <w:r>
+              <w:t>Cluster</w:t>
+            </w:r>
+            <w:proofErr w:type="spellEnd"/>
+            <w:proofErr w:type="gramEnd"/>
+            <w:r>
+              <w:t xml:space="preserve"> 2</w:t>
+            </w:r>
+          </w:p>
+        </w:tc>
+        <w:tc>
+          <w:tcPr>
+            <w:tcW w:w="1699" w:type="dxa"/>
+          </w:tcPr>
+          <w:p>
+            <w:pPr>
+              <w:jc w:val="center"/>
+              <w:rPr>
+                <w:lang w:val="en-GB"/>
+              </w:rPr>
+            </w:pPr>
+            <w:r>
+              <w:rPr>
+                <w:lang w:val="en-GB"/>
+              </w:rPr>
+              <w:t>183</w:t>
+            </w:r>
+          </w:p>
+        </w:tc>
+        <w:tc>
+          <w:tcPr>
+            <w:tcW w:w="1699" w:type="dxa"/>
+          </w:tcPr>
+          <w:p>
+            <w:pPr>
+              <w:jc w:val="center"/>
+              <w:rPr>
+                <w:lang w:val="en-GB"/>
+              </w:rPr>
+            </w:pPr>
+            <w:r>
+              <w:rPr>
+                <w:lang w:val="en-GB"/>
+              </w:rPr>
+              <w:t>176</w:t>
+            </w:r>
+          </w:p>
+        </w:tc>
+        <w:tc>
+          <w:tcPr>
+            <w:tcW w:w="1699" w:type="dxa"/>
+          </w:tcPr>
+          <w:p>
+            <w:pPr>
+              <w:jc w:val="center"/>
+              <w:rPr>
+                <w:lang w:val="en-GB"/>
+              </w:rPr>
+            </w:pPr>
+            <w:r>
+              <w:rPr>
+                <w:lang w:val="en-GB"/>
+              </w:rPr>
+              <w:t>534</w:t>
+            </w:r>
+          </w:p>
+        </w:tc>
+        <w:tc>
+          <w:tcPr>
+            <w:tcW w:w="1699" w:type="dxa"/>
+          </w:tcPr>
+          <w:p>
+            <w:pPr>
+              <w:jc w:val="center"/>
+              <w:rPr>
+                <w:lang w:val="en-GB"/>
+              </w:rPr>
+            </w:pPr>
+            <w:r>
+              <w:rPr>
+                <w:lang w:val="en-GB"/>
+              </w:rPr>
+              <w:t>129</w:t>
+            </w:r>
+          </w:p>
+        </w:tc>
+      </w:tr>
+      <w:tr>
+        <w:tc>
+          <w:tcPr>
+            <w:tcW w:w="1698" w:type="dxa"/>
+          </w:tcPr>
+          <w:p>
+            <w:pPr>
+              <w:jc w:val="center"/>
+              <w:rPr>
+                <w:lang w:val="en-GB"/>
+              </w:rPr>
+            </w:pPr>
+            <w:proofErr w:type="spellStart"/>
+            <w:proofErr w:type="gramStart"/>
+            <w:r>
+              <w:t>Cluster</w:t>
+            </w:r>
+            <w:proofErr w:type="spellEnd"/>
+            <w:proofErr w:type="gramEnd"/>
+            <w:r>
+              <w:t xml:space="preserve"> 3</w:t>
+            </w:r>
+          </w:p>
+        </w:tc>
+        <w:tc>
+          <w:tcPr>
+            <w:tcW w:w="1699" w:type="dxa"/>
+          </w:tcPr>
+          <w:p>
+            <w:pPr>
+              <w:jc w:val="center"/>
+              <w:rPr>
+                <w:lang w:val="en-GB"/>
+              </w:rPr>
+            </w:pPr>
+            <w:r>
+              <w:rPr>
+                <w:lang w:val="en-GB"/>
+              </w:rPr>
+              <w:t>207</w:t>
+            </w:r>
+          </w:p>
+        </w:tc>
+        <w:tc>
+          <w:tcPr>
+            <w:tcW w:w="1699" w:type="dxa"/>
+          </w:tcPr>
+          <w:p>
+            <w:pPr>
+              <w:jc w:val="center"/>
+              <w:rPr>
+                <w:lang w:val="en-GB"/>
+              </w:rPr>
+            </w:pPr>
+            <w:r>
+              <w:rPr>
+                <w:lang w:val="en-GB"/>
+              </w:rPr>
+              <w:t>154</w:t>
+            </w:r>
+          </w:p>
+        </w:tc>
+        <w:tc>
+          <w:tcPr>
+            <w:tcW w:w="1699" w:type="dxa"/>
+          </w:tcPr>
+          <w:p>
+            <w:pPr>
+              <w:jc w:val="center"/>
+              <w:rPr>
+                <w:lang w:val="en-GB"/>
+              </w:rPr>
+            </w:pPr>
+            <w:r>
+              <w:rPr>
+                <w:lang w:val="en-GB"/>
+              </w:rPr>
+              <w:t>631</w:t>
+            </w:r>
+          </w:p>
+        </w:tc>
+        <w:tc>
+          <w:tcPr>
+            <w:tcW w:w="1699" w:type="dxa"/>
+          </w:tcPr>
+          <w:p>
+            <w:pPr>
+              <w:jc w:val="center"/>
+              <w:rPr>
+                <w:lang w:val="en-GB"/>
+              </w:rPr>
+            </w:pPr>
+            <w:r>
+              <w:rPr>
+                <w:lang w:val="en-GB"/>
+              </w:rPr>
+              <w:t>132</w:t>
+            </w:r>
+          </w:p>
+        </w:tc>
+      </w:tr>
+      <w:tr>
+        <w:tc>
+          <w:tcPr>
+            <w:tcW w:w="1698" w:type="dxa"/>
+          </w:tcPr>
+          <w:p>
+            <w:pPr>
+              <w:jc w:val="center"/>
+              <w:rPr>
+                <w:lang w:val="en-GB"/>
+              </w:rPr>
+            </w:pPr>
+            <w:proofErr w:type="spellStart"/>
+            <w:proofErr w:type="gramStart"/>
+            <w:r>
+              <w:t>Cluster</w:t>
+            </w:r>
+            <w:proofErr w:type="spellEnd"/>
+            <w:proofErr w:type="gramEnd"/>
+            <w:r>
+              <w:t xml:space="preserve"> 4</w:t>
+            </w:r>
+          </w:p>
+        </w:tc>
+        <w:tc>
+          <w:tcPr>
+            <w:tcW w:w="1699" w:type="dxa"/>
+          </w:tcPr>
+          <w:p>
+            <w:pPr>
+              <w:jc w:val="center"/>
+              <w:rPr>
+                <w:lang w:val="en-GB"/>
+              </w:rPr>
+            </w:pPr>
+            <w:r>
+              <w:rPr>
+                <w:lang w:val="en-GB"/>
+              </w:rPr>
+              <w:t>87</w:t>
+            </w:r>
+          </w:p>
+        </w:tc>
+        <w:tc>
+          <w:tcPr>
+            <w:tcW w:w="1699" w:type="dxa"/>
+          </w:tcPr>
+          <w:p>
+            <w:pPr>
+              <w:jc w:val="center"/>
+              <w:rPr>
+                <w:lang w:val="en-GB"/>
+              </w:rPr>
+            </w:pPr>
+            <w:r>
+              <w:rPr>
+                <w:lang w:val="en-GB"/>
+              </w:rPr>
+              <w:t>55</w:t>
+            </w:r>
+          </w:p>
+        </w:tc>
+        <w:tc>
+          <w:tcPr>
+            <w:tcW w:w="1699" w:type="dxa"/>
+          </w:tcPr>
+          <w:p>
+            <w:pPr>
+              <w:jc w:val="center"/>
+              <w:rPr>
+                <w:lang w:val="en-GB"/>
+              </w:rPr>
+            </w:pPr>
+            <w:r>
+              <w:rPr>
+                <w:lang w:val="en-GB"/>
+              </w:rPr>
+              <w:t>218</w:t>
+            </w:r>
+          </w:p>
+        </w:tc>
+        <w:tc>
+          <w:tcPr>
+            <w:tcW w:w="1699" w:type="dxa"/>
+          </w:tcPr>
+          <w:p>
+            <w:pPr>
+              <w:jc w:val="center"/>
+              <w:rPr>
+                <w:lang w:val="en-GB"/>
+              </w:rPr>
+            </w:pPr>
+            <w:r>
+              <w:rPr>
+                <w:lang w:val="en-GB"/>
+              </w:rPr>
+              <w:t>63</w:t>
+            </w:r>
+          </w:p>
+        </w:tc>
+      </w:tr>
+      <w:tr>
+        <w:tc>
+          <w:tcPr>
+            <w:tcW w:w="1698" w:type="dxa"/>
+          </w:tcPr>
+          <w:p>
+            <w:pPr>
+              <w:jc w:val="center"/>
+              <w:rPr>
+                <w:lang w:val="en-GB"/>
+              </w:rPr>
+            </w:pPr>
+            <w:proofErr w:type="spellStart"/>
+            <w:proofErr w:type="gramStart"/>
+            <w:r>
+              <w:t>Cluster</w:t>
+            </w:r>
+            <w:proofErr w:type="spellEnd"/>
+            <w:proofErr w:type="gramEnd"/>
+            <w:r>
+              <w:t xml:space="preserve"> 5</w:t>
+            </w:r>
+          </w:p>
+        </w:tc>
+        <w:tc>
+          <w:tcPr>
+            <w:tcW w:w="1699" w:type="dxa"/>
+          </w:tcPr>
+          <w:p>
+            <w:pPr>
+              <w:jc w:val="center"/>
+              <w:rPr>
+                <w:lang w:val="en-GB"/>
+              </w:rPr>
+            </w:pPr>
+            <w:r>
+              <w:rPr>
+                <w:lang w:val="en-GB"/>
+              </w:rPr>
+              <w:t>100</w:t>
+            </w:r>
+          </w:p>
+        </w:tc>
+        <w:tc>
+          <w:tcPr>
+            <w:tcW w:w="1699" w:type="dxa"/>
+          </w:tcPr>
+          <w:p>
+            <w:pPr>
+              <w:jc w:val="center"/>
+              <w:rPr>
+                <w:lang w:val="en-GB"/>
+              </w:rPr>
+            </w:pPr>
+            <w:r>
+              <w:rPr>
+                <w:lang w:val="en-GB"/>
+              </w:rPr>
+              <w:t>65</w:t>
+            </w:r>
+          </w:p>
+        </w:tc>
+        <w:tc>
+          <w:tcPr>
+            <w:tcW w:w="1699" w:type="dxa"/>
+          </w:tcPr>
+          <w:p>
+            <w:pPr>
+              <w:jc w:val="center"/>
+              <w:rPr>
+                <w:lang w:val="en-GB"/>
+              </w:rPr>
+            </w:pPr>
+            <w:r>
+              <w:rPr>
+                <w:lang w:val="en-GB"/>
+              </w:rPr>
+              <w:t>230</w:t>
+            </w:r>
+          </w:p>
+        </w:tc>
+        <w:tc>
+          <w:tcPr>
+            <w:tcW w:w="1699" w:type="dxa"/>
+          </w:tcPr>
+          <w:p>
+            <w:pPr>
+              <w:jc w:val="center"/>
+              <w:rPr>
+                <w:lang w:val="en-GB"/>
+              </w:rPr>
+            </w:pPr>
+            <w:r>
+              <w:rPr>
+                <w:lang w:val="en-GB"/>
+              </w:rPr>
+              <w:t>57</w:t>
+            </w:r>
+          </w:p>
+        </w:tc>
+      </w:tr>
+    </w:tbl>
+    <w:p/>
+    <w:p>
+      <w:r>
+        <w:drawing>
+          <wp:inline distT="0" distB="0" distL="0" distR="0" wp14:anchorId="034831C7" wp14:editId="1DD5EC83">
+            <wp:extent cx="5400040" cy="2908300"/>
+            <wp:effectExtent l="0" t="0" r="0" b="6350"/>
+            <wp:docPr id="1794654788" name="Imagen 1" descr="Imagen que contiene Patrón de fondo&#10;&#10;El contenido generado por IA puede ser incorrecto."/>
+            <wp:cNvGraphicFramePr>
+              <a:graphicFrameLocks xmlns:a="http://schemas.openxmlformats.org/drawingml/2006/main" noChangeAspect="1"/>
+            </wp:cNvGraphicFramePr>
+            <a:graphic xmlns:a="http://schemas.openxmlformats.org/drawingml/2006/main">
+              <a:graphicData uri="http://schemas.openxmlformats.org/drawingml/2006/picture">
+                <pic:pic xmlns:pic="http://schemas.openxmlformats.org/drawingml/2006/picture">
+                  <pic:nvPicPr>
+                    <pic:cNvPr id="1794654788" name="Imagen 1" descr="Imagen que contiene Patrón de fondo&#10;&#10;El contenido generado por IA puede ser incorrecto."/>
+                    <pic:cNvPicPr/>
+                  </pic:nvPicPr>
+                  <pic:blipFill>
+                    <a:blip r:embed="rId8"/>
+                    <a:stretch>
+                      <a:fillRect/>
+                    </a:stretch>
+                  </pic:blipFill>
+                  <pic:spPr>
+                    <a:xfrm>
+                      <a:off x="0" y="0"/>
+                      <a:ext cx="5400040" cy="2908300"/>
+                    </a:xfrm>
+                    <a:prstGeom prst="rect">
+                      <a:avLst/>
+                    </a:prstGeom>
+                  </pic:spPr>
+                </pic:pic>
+              </a:graphicData>
+            </a:graphic>
+          </wp:inline>
+        </w:drawing>
       </w:r>
     </w:p>
     <w:p>
@@ -734,25 +2173,68 @@
         <w:jc w:val="both"/>
       </w:pPr>
       <w:r>
-        <w:t xml:space="preserve">Sin embargo, estas diferencias no implican contradicción entre métodos, sino </w:t>
-      </w:r>
-      <w:r>
-        <w:rPr>
-          <w:b/>
-          <w:bCs/>
-        </w:rPr>
-        <w:t>complementariedad</w:t>
-      </w:r>
-      <w:r>
-        <w:t>:</w:t>
-      </w:r>
-      <w:r>
-        <w:br/>
-        <w:t>– El modelo Manhattan ofrece una visión más detallada y estricta de las relaciones temáticas.</w:t>
-      </w:r>
-      <w:r>
-        <w:br/>
-        <w:t>– El modelo UMAP revela la organización global del espacio conceptual, destacando los grandes ejes temáticos y reduciendo fragmentaciones innecesarias.</w:t>
+        <w:lastRenderedPageBreak/>
+        <w:t xml:space="preserve">La comparación entre modelos muestra que las agrupaciones generadas a partir de las </w:t>
+      </w:r>
+      <w:proofErr w:type="spellStart"/>
+      <w:r>
+        <w:t>keywords</w:t>
+      </w:r>
+      <w:proofErr w:type="spellEnd"/>
+      <w:r>
+        <w:t xml:space="preserve"> no son consistentes entre ambas metodologías. Tanto en la comparación de investigadores como en la comparación de </w:t>
+      </w:r>
+      <w:proofErr w:type="spellStart"/>
+      <w:r>
+        <w:t>keywords</w:t>
+      </w:r>
+      <w:proofErr w:type="spellEnd"/>
+      <w:r>
+        <w:t xml:space="preserve">, los modelos ofrecen estructuras de </w:t>
+      </w:r>
+      <w:proofErr w:type="spellStart"/>
+      <w:r>
+        <w:t>clustering</w:t>
+      </w:r>
+      <w:proofErr w:type="spellEnd"/>
+      <w:r>
+        <w:t xml:space="preserve"> muy diferentes. El modelo sin UMAP produce cinco </w:t>
+      </w:r>
+      <w:proofErr w:type="spellStart"/>
+      <w:proofErr w:type="gramStart"/>
+      <w:r>
+        <w:t>clusters</w:t>
+      </w:r>
+      <w:proofErr w:type="spellEnd"/>
+      <w:proofErr w:type="gramEnd"/>
+      <w:r>
+        <w:t xml:space="preserve"> relativamente diferenciados, mientras que el modelo con UMAP tiende a concentrar tanto investigadores como </w:t>
+      </w:r>
+      <w:proofErr w:type="spellStart"/>
+      <w:r>
+        <w:t>keywords</w:t>
+      </w:r>
+      <w:proofErr w:type="spellEnd"/>
+      <w:r>
+        <w:t xml:space="preserve"> en un único </w:t>
+      </w:r>
+      <w:proofErr w:type="spellStart"/>
+      <w:r>
+        <w:t>macrocluster</w:t>
+      </w:r>
+      <w:proofErr w:type="spellEnd"/>
+      <w:r>
+        <w:t xml:space="preserve"> (</w:t>
+      </w:r>
+      <w:proofErr w:type="spellStart"/>
+      <w:proofErr w:type="gramStart"/>
+      <w:r>
+        <w:t>Cluster</w:t>
+      </w:r>
+      <w:proofErr w:type="spellEnd"/>
+      <w:proofErr w:type="gramEnd"/>
+      <w:r>
+        <w:t xml:space="preserve"> 3).</w:t>
       </w:r>
     </w:p>
     <w:p>
@@ -760,30 +2242,17 @@
         <w:jc w:val="both"/>
       </w:pPr>
       <w:r>
-        <w:t xml:space="preserve">A pesar de esta reducción de granularidad, los investigadores que forman parte de los </w:t>
+        <w:t xml:space="preserve">Este comportamiento indica que la estructura de grupos en el espacio de representación no es robusta: las divisiones dependen fuertemente del método de reducción de dimensionalidad utilizado. UMAP, al comprimir las relaciones de proximidad en un espacio de menor dimensión, pierde parte de la variabilidad temática que el modelo sin UMAP sí retiene. Como consecuencia, la mayoría de los términos temáticos acaban agrupados en un mismo </w:t>
       </w:r>
       <w:proofErr w:type="spellStart"/>
       <w:proofErr w:type="gramStart"/>
       <w:r>
-        <w:t>clusters</w:t>
+        <w:t>cluster</w:t>
       </w:r>
       <w:proofErr w:type="spellEnd"/>
       <w:proofErr w:type="gramEnd"/>
       <w:r>
-        <w:t xml:space="preserve"> UMAP aparecen, en su mayoría, también agrupados entre sí en el modelo Manhattan. Esto constituye un indicio claro de consistencia:</w:t>
-      </w:r>
-      <w:r>
-        <w:br/>
-      </w:r>
-      <w:r>
-        <w:rPr>
-          <w:b/>
-          <w:bCs/>
-        </w:rPr>
-        <w:t>los dos métodos detectan fundamentalmente las mismas grandes estructuras</w:t>
-      </w:r>
-      <w:r>
-        <w:t>, aunque con diferente resolución.</w:t>
+        <w:t xml:space="preserve"> en el modelo UMAP, lo que limita la capacidad de extraer una segmentación temática clara y estable.</w:t>
       </w:r>
     </w:p>
     <w:p>
@@ -791,7 +2260,7 @@
         <w:jc w:val="both"/>
       </w:pPr>
       <w:r>
-        <w:t xml:space="preserve">En cuanto a las </w:t>
+        <w:t xml:space="preserve">Por tanto, no puede afirmarse que exista una estructura clara y consistente de agrupamientos temáticos entre los investigadores del IUMPA basada únicamente en las </w:t>
       </w:r>
       <w:proofErr w:type="spellStart"/>
       <w:r>
@@ -799,154 +2268,26 @@
       </w:r>
       <w:proofErr w:type="spellEnd"/>
       <w:r>
-        <w:t xml:space="preserve">, la coincidencia es también notable. Las palabras clave dominantes de cada </w:t>
-      </w:r>
-      <w:proofErr w:type="spellStart"/>
-      <w:proofErr w:type="gramStart"/>
-      <w:r>
-        <w:t>cluster</w:t>
-      </w:r>
-      <w:proofErr w:type="spellEnd"/>
-      <w:proofErr w:type="gramEnd"/>
-      <w:r>
-        <w:t xml:space="preserve"> UMAP aparecen entre las palabras más representativas de los </w:t>
-      </w:r>
-      <w:proofErr w:type="spellStart"/>
-      <w:proofErr w:type="gramStart"/>
+        <w:t xml:space="preserve"> asociadas a sus publicaciones. La falta de correspondencia entre modelos sugiere que los datos no contienen </w:t>
+      </w:r>
+      <w:proofErr w:type="spellStart"/>
       <w:r>
         <w:t>clusters</w:t>
       </w:r>
       <w:proofErr w:type="spellEnd"/>
-      <w:proofErr w:type="gramEnd"/>
-      <w:r>
-        <w:t xml:space="preserve"> Manhattan relacionados. Por ejemplo, cuando un </w:t>
-      </w:r>
-      <w:proofErr w:type="spellStart"/>
-      <w:proofErr w:type="gramStart"/>
-      <w:r>
-        <w:t>cluster</w:t>
-      </w:r>
-      <w:proofErr w:type="spellEnd"/>
-      <w:proofErr w:type="gramEnd"/>
-      <w:r>
-        <w:t xml:space="preserve"> Manhattan presenta un conjunto de </w:t>
-      </w:r>
-      <w:proofErr w:type="spellStart"/>
-      <w:r>
-        <w:t>keywords</w:t>
-      </w:r>
-      <w:proofErr w:type="spellEnd"/>
-      <w:r>
-        <w:t xml:space="preserve"> como “</w:t>
-      </w:r>
-      <w:proofErr w:type="spellStart"/>
-      <w:r>
-        <w:t>differential_equations</w:t>
-      </w:r>
-      <w:proofErr w:type="spellEnd"/>
-      <w:r>
-        <w:t>”, “</w:t>
-      </w:r>
-      <w:proofErr w:type="spellStart"/>
-      <w:r>
-        <w:t>pde</w:t>
-      </w:r>
-      <w:proofErr w:type="spellEnd"/>
-      <w:r>
-        <w:t>”, “</w:t>
-      </w:r>
-      <w:proofErr w:type="spellStart"/>
-      <w:r>
-        <w:t>analysis</w:t>
-      </w:r>
-      <w:proofErr w:type="spellEnd"/>
-      <w:r>
-        <w:t>”, “</w:t>
-      </w:r>
-      <w:proofErr w:type="spellStart"/>
-      <w:r>
-        <w:t>variational</w:t>
-      </w:r>
-      <w:proofErr w:type="spellEnd"/>
-      <w:r>
-        <w:t xml:space="preserve">”, el </w:t>
-      </w:r>
-      <w:proofErr w:type="spellStart"/>
-      <w:proofErr w:type="gramStart"/>
-      <w:r>
-        <w:t>cluster</w:t>
-      </w:r>
-      <w:proofErr w:type="spellEnd"/>
-      <w:proofErr w:type="gramEnd"/>
-      <w:r>
-        <w:t xml:space="preserve"> equivalente de UMAP incluye también estas palabras con frecuencias relativas muy altas. Esto indica que las temáticas fundamentales asociadas a cada grupo se conservan incluso tras aplicar una transformación no lineal del espacio vectorial.</w:t>
+      <w:r>
+        <w:t xml:space="preserve"> naturales fuertes, sino una estructura más difusa donde distintos métodos pueden producir particiones muy distintas.</w:t>
       </w:r>
     </w:p>
     <w:p>
-      <w:pPr>
-        <w:jc w:val="both"/>
-      </w:pPr>
-      <w:r>
-        <w:t xml:space="preserve">Finalmente, la comparación conjunta muestra que ninguno de los métodos contradice la estructura conceptual detectada por el otro. Las divergencias observadas (como la fusión de dos </w:t>
-      </w:r>
-      <w:proofErr w:type="spellStart"/>
-      <w:proofErr w:type="gramStart"/>
-      <w:r>
-        <w:t>clusters</w:t>
-      </w:r>
-      <w:proofErr w:type="spellEnd"/>
-      <w:proofErr w:type="gramEnd"/>
-      <w:r>
-        <w:t xml:space="preserve"> Manhattan en uno solo en UMAP) no suponen incoherencia, sino ajustes esperables derivados de la diferencia entre métricas lineales y representaciones no lineales del espacio de </w:t>
-      </w:r>
-      <w:proofErr w:type="spellStart"/>
-      <w:r>
-        <w:t>embeddings</w:t>
-      </w:r>
-      <w:proofErr w:type="spellEnd"/>
-      <w:r>
-        <w:t>.</w:t>
-      </w:r>
-      <w:r>
-        <w:br/>
-        <w:t xml:space="preserve">La consistencia temática observada en las </w:t>
-      </w:r>
-      <w:proofErr w:type="spellStart"/>
-      <w:r>
-        <w:t>keywords</w:t>
-      </w:r>
-      <w:proofErr w:type="spellEnd"/>
-      <w:r>
-        <w:t xml:space="preserve"> y en la composición de los grupos </w:t>
-      </w:r>
-      <w:r>
-        <w:lastRenderedPageBreak/>
-        <w:t>confirma que ambos métodos reconocen esencialmente las mismas áreas de investigación dentro del conjunto de investigadores.</w:t>
+      <w:r>
+        <w:t>S</w:t>
+      </w:r>
+      <w:r>
+        <w:t xml:space="preserve">e decide emplear el modelo de … debido a que, manualmente, se decide que es el que mejor podría representar estructuras internas del instituto (lo que diga Calabuig). </w:t>
       </w:r>
     </w:p>
-    <w:p>
-      <w:pPr>
-        <w:jc w:val="both"/>
-      </w:pPr>
-      <w:r>
-        <w:t xml:space="preserve">En conclusión, los dos modelos convergen en identificar un patrón estable y coherente de agrupación temática. El método Manhattan proporciona una segmentación algo más fina, mientras que UMAP ofrece una visión más global y estructural del espacio conceptual. La coincidencia en los núcleos temáticos y en los grupos principales valida que existe una organización robusta detrás de los datos, lo que refuerza la fiabilidad del análisis y aporta evidencia sólida de que los </w:t>
-      </w:r>
-      <w:proofErr w:type="spellStart"/>
-      <w:proofErr w:type="gramStart"/>
-      <w:r>
-        <w:t>clusters</w:t>
-      </w:r>
-      <w:proofErr w:type="spellEnd"/>
-      <w:proofErr w:type="gramEnd"/>
-      <w:r>
-        <w:t xml:space="preserve"> identificados reflejan verdaderas afinidades investigadoras dentro del conjunto estudiado.</w:t>
-      </w:r>
-    </w:p>
-    <w:p>
-      <w:pPr>
-        <w:jc w:val="both"/>
-      </w:pPr>
-    </w:p>
+    <w:p/>
     <w:sectPr>
       <w:pgSz w:w="11906" w:h="16838"/>
       <w:pgMar w:top="1417" w:right="1701" w:bottom="1417" w:left="1701" w:header="708" w:footer="708" w:gutter="0"/>
@@ -955,6 +2296,163 @@
     </w:sectPr>
   </w:body>
 </w:document>
+</file>
+
+<file path=word/numbering.xml><?xml version="1.0" encoding="utf-8"?>
+<w:numbering xmlns:wpc="http://schemas.microsoft.com/office/word/2010/wordprocessingCanvas" xmlns:cx="http://schemas.microsoft.com/office/drawing/2014/chartex" xmlns:cx1="http://schemas.microsoft.com/office/drawing/2015/9/8/chartex" xmlns:cx2="http://schemas.microsoft.com/office/drawing/2015/10/21/chartex" xmlns:cx3="http://schemas.microsoft.com/office/drawing/2016/5/9/chartex" xmlns:cx4="http://schemas.microsoft.com/office/drawing/2016/5/10/chartex" xmlns:cx5="http://schemas.microsoft.com/office/drawing/2016/5/11/chartex" xmlns:cx6="http://schemas.microsoft.com/office/drawing/2016/5/12/chartex" xmlns:cx7="http://schemas.microsoft.com/office/drawing/2016/5/13/chartex" xmlns:cx8="http://schemas.microsoft.com/office/drawing/2016/5/14/chartex" xmlns:mc="http://schemas.openxmlformats.org/markup-compatibility/2006" xmlns:aink="http://schemas.microsoft.com/office/drawing/2016/ink" xmlns:am3d="http://schemas.microsoft.com/office/drawing/2017/model3d" xmlns:o="urn:schemas-microsoft-com:office:office" xmlns:oel="http://schemas.microsoft.com/office/2019/extlst" xmlns:r="http://schemas.openxmlformats.org/officeDocument/2006/relationships" xmlns:m="http://schemas.openxmlformats.org/officeDocument/2006/math" xmlns:v="urn:schemas-microsoft-com:vml" xmlns:wp14="http://schemas.microsoft.com/office/word/2010/wordprocessingDrawing" xmlns:wp="http://schemas.openxmlformats.org/drawingml/2006/wordprocessingDrawing" xmlns:w10="urn:schemas-microsoft-com:office:word" xmlns:w="http://schemas.openxmlformats.org/wordprocessingml/2006/main" xmlns:w14="http://schemas.microsoft.com/office/word/2010/wordml" xmlns:w15="http://schemas.microsoft.com/office/word/2012/wordml" xmlns:w16cex="http://schemas.microsoft.com/office/word/2018/wordml/cex" xmlns:w16cid="http://schemas.microsoft.com/office/word/2016/wordml/cid" xmlns:w16="http://schemas.microsoft.com/office/word/2018/wordml" xmlns:w16du="http://schemas.microsoft.com/office/word/2023/wordml/word16du" xmlns:w16sdtdh="http://schemas.microsoft.com/office/word/2020/wordml/sdtdatahash" xmlns:w16sdtfl="http://schemas.microsoft.com/office/word/2024/wordml/sdtformatlock" xmlns:w16se="http://schemas.microsoft.com/office/word/2015/wordml/symex" xmlns:wpg="http://schemas.microsoft.com/office/word/2010/wordprocessingGroup" xmlns:wpi="http://schemas.microsoft.com/office/word/2010/wordprocessingInk" xmlns:wne="http://schemas.microsoft.com/office/word/2006/wordml" xmlns:wps="http://schemas.microsoft.com/office/word/2010/wordprocessingShape" mc:Ignorable="w14 w15 w16se w16cid w16 w16cex w16sdtdh w16sdtfl w16du wp14">
+  <w:abstractNum w:abstractNumId="0" w15:restartNumberingAfterBreak="0">
+    <w:nsid w:val="30B71740"/>
+    <w:multiLevelType w:val="multilevel"/>
+    <w:tmpl w:val="6F987636"/>
+    <w:lvl w:ilvl="0">
+      <w:start w:val="1"/>
+      <w:numFmt w:val="bullet"/>
+      <w:lvlText w:val=""/>
+      <w:lvlJc w:val="left"/>
+      <w:pPr>
+        <w:tabs>
+          <w:tab w:val="num" w:pos="720"/>
+        </w:tabs>
+        <w:ind w:left="720" w:hanging="360"/>
+      </w:pPr>
+      <w:rPr>
+        <w:rFonts w:ascii="Symbol" w:hAnsi="Symbol" w:hint="default"/>
+        <w:sz w:val="20"/>
+      </w:rPr>
+    </w:lvl>
+    <w:lvl w:ilvl="1" w:tentative="1">
+      <w:start w:val="1"/>
+      <w:numFmt w:val="bullet"/>
+      <w:lvlText w:val="o"/>
+      <w:lvlJc w:val="left"/>
+      <w:pPr>
+        <w:tabs>
+          <w:tab w:val="num" w:pos="1440"/>
+        </w:tabs>
+        <w:ind w:left="1440" w:hanging="360"/>
+      </w:pPr>
+      <w:rPr>
+        <w:rFonts w:ascii="Courier New" w:hAnsi="Courier New" w:hint="default"/>
+        <w:sz w:val="20"/>
+      </w:rPr>
+    </w:lvl>
+    <w:lvl w:ilvl="2" w:tentative="1">
+      <w:start w:val="1"/>
+      <w:numFmt w:val="bullet"/>
+      <w:lvlText w:val=""/>
+      <w:lvlJc w:val="left"/>
+      <w:pPr>
+        <w:tabs>
+          <w:tab w:val="num" w:pos="2160"/>
+        </w:tabs>
+        <w:ind w:left="2160" w:hanging="360"/>
+      </w:pPr>
+      <w:rPr>
+        <w:rFonts w:ascii="Wingdings" w:hAnsi="Wingdings" w:hint="default"/>
+        <w:sz w:val="20"/>
+      </w:rPr>
+    </w:lvl>
+    <w:lvl w:ilvl="3" w:tentative="1">
+      <w:start w:val="1"/>
+      <w:numFmt w:val="bullet"/>
+      <w:lvlText w:val=""/>
+      <w:lvlJc w:val="left"/>
+      <w:pPr>
+        <w:tabs>
+          <w:tab w:val="num" w:pos="2880"/>
+        </w:tabs>
+        <w:ind w:left="2880" w:hanging="360"/>
+      </w:pPr>
+      <w:rPr>
+        <w:rFonts w:ascii="Wingdings" w:hAnsi="Wingdings" w:hint="default"/>
+        <w:sz w:val="20"/>
+      </w:rPr>
+    </w:lvl>
+    <w:lvl w:ilvl="4" w:tentative="1">
+      <w:start w:val="1"/>
+      <w:numFmt w:val="bullet"/>
+      <w:lvlText w:val=""/>
+      <w:lvlJc w:val="left"/>
+      <w:pPr>
+        <w:tabs>
+          <w:tab w:val="num" w:pos="3600"/>
+        </w:tabs>
+        <w:ind w:left="3600" w:hanging="360"/>
+      </w:pPr>
+      <w:rPr>
+        <w:rFonts w:ascii="Wingdings" w:hAnsi="Wingdings" w:hint="default"/>
+        <w:sz w:val="20"/>
+      </w:rPr>
+    </w:lvl>
+    <w:lvl w:ilvl="5" w:tentative="1">
+      <w:start w:val="1"/>
+      <w:numFmt w:val="bullet"/>
+      <w:lvlText w:val=""/>
+      <w:lvlJc w:val="left"/>
+      <w:pPr>
+        <w:tabs>
+          <w:tab w:val="num" w:pos="4320"/>
+        </w:tabs>
+        <w:ind w:left="4320" w:hanging="360"/>
+      </w:pPr>
+      <w:rPr>
+        <w:rFonts w:ascii="Wingdings" w:hAnsi="Wingdings" w:hint="default"/>
+        <w:sz w:val="20"/>
+      </w:rPr>
+    </w:lvl>
+    <w:lvl w:ilvl="6" w:tentative="1">
+      <w:start w:val="1"/>
+      <w:numFmt w:val="bullet"/>
+      <w:lvlText w:val=""/>
+      <w:lvlJc w:val="left"/>
+      <w:pPr>
+        <w:tabs>
+          <w:tab w:val="num" w:pos="5040"/>
+        </w:tabs>
+        <w:ind w:left="5040" w:hanging="360"/>
+      </w:pPr>
+      <w:rPr>
+        <w:rFonts w:ascii="Wingdings" w:hAnsi="Wingdings" w:hint="default"/>
+        <w:sz w:val="20"/>
+      </w:rPr>
+    </w:lvl>
+    <w:lvl w:ilvl="7" w:tentative="1">
+      <w:start w:val="1"/>
+      <w:numFmt w:val="bullet"/>
+      <w:lvlText w:val=""/>
+      <w:lvlJc w:val="left"/>
+      <w:pPr>
+        <w:tabs>
+          <w:tab w:val="num" w:pos="5760"/>
+        </w:tabs>
+        <w:ind w:left="5760" w:hanging="360"/>
+      </w:pPr>
+      <w:rPr>
+        <w:rFonts w:ascii="Wingdings" w:hAnsi="Wingdings" w:hint="default"/>
+        <w:sz w:val="20"/>
+      </w:rPr>
+    </w:lvl>
+    <w:lvl w:ilvl="8" w:tentative="1">
+      <w:start w:val="1"/>
+      <w:numFmt w:val="bullet"/>
+      <w:lvlText w:val=""/>
+      <w:lvlJc w:val="left"/>
+      <w:pPr>
+        <w:tabs>
+          <w:tab w:val="num" w:pos="6480"/>
+        </w:tabs>
+        <w:ind w:left="6480" w:hanging="360"/>
+      </w:pPr>
+      <w:rPr>
+        <w:rFonts w:ascii="Wingdings" w:hAnsi="Wingdings" w:hint="default"/>
+        <w:sz w:val="20"/>
+      </w:rPr>
+    </w:lvl>
+  </w:abstractNum>
+  <w:num w:numId="1" w16cid:durableId="789786191">
+    <w:abstractNumId w:val="0"/>
+  </w:num>
+</w:numbering>
 </file>
 
 <file path=word/styles.xml><?xml version="1.0" encoding="utf-8"?>
@@ -1357,6 +2855,7 @@
   <w:style w:type="paragraph" w:default="1" w:styleId="Normal">
     <w:name w:val="Normal"/>
     <w:qFormat/>
+    <w:rsid w:val="00F478D4"/>
   </w:style>
   <w:style w:type="paragraph" w:styleId="Ttulo1">
     <w:name w:val="heading 1"/>
@@ -1883,6 +3382,25 @@
       <w:color w:val="666666"/>
     </w:rPr>
   </w:style>
+  <w:style w:type="table" w:styleId="Tablaconcuadrcula">
+    <w:name w:val="Table Grid"/>
+    <w:basedOn w:val="Tablanormal"/>
+    <w:uiPriority w:val="39"/>
+    <w:rsid w:val="00484094"/>
+    <w:pPr>
+      <w:spacing w:after="0" w:line="240" w:lineRule="auto"/>
+    </w:pPr>
+    <w:tblPr>
+      <w:tblBorders>
+        <w:top w:val="single" w:sz="4" w:space="0" w:color="auto"/>
+        <w:left w:val="single" w:sz="4" w:space="0" w:color="auto"/>
+        <w:bottom w:val="single" w:sz="4" w:space="0" w:color="auto"/>
+        <w:right w:val="single" w:sz="4" w:space="0" w:color="auto"/>
+        <w:insideH w:val="single" w:sz="4" w:space="0" w:color="auto"/>
+        <w:insideV w:val="single" w:sz="4" w:space="0" w:color="auto"/>
+      </w:tblBorders>
+    </w:tblPr>
+  </w:style>
 </w:styles>
 </file>
 

</xml_diff>